<commit_message>
[update] Introdução + primeiro tópico
</commit_message>
<xml_diff>
--- a/2026/trabalhos/TCC/ARTIGO_Historiando.docx
+++ b/2026/trabalhos/TCC/ARTIGO_Historiando.docx
@@ -111,7 +111,7 @@
           <w:sz w:val="24"/>
           <w:szCs w:val="24"/>
         </w:rPr>
-        <w:t>HISTORIANDO</w:t>
+        <w:t>COMO JOGOS DIGITAIS PODEM AUXILIAR NO APRENDIZADO DA HISTÓRIA DO BRASIL</w:t>
       </w:r>
     </w:p>
     <w:p>
@@ -516,37 +516,57 @@
           <w:sz w:val="24"/>
           <w:szCs w:val="24"/>
         </w:rPr>
-        <w:t>1 INTRODUÇÃO</w:t>
-      </w:r>
-    </w:p>
-    <w:p>
-      <w:pPr>
-        <w:spacing w:after="0" w:line="360" w:lineRule="auto"/>
-        <w:jc w:val="center"/>
-        <w:rPr>
-          <w:rFonts w:ascii="Arial" w:hAnsi="Arial" w:cs="Arial"/>
-          <w:sz w:val="24"/>
-          <w:szCs w:val="24"/>
-        </w:rPr>
-      </w:pPr>
-    </w:p>
-    <w:p>
-      <w:pPr>
-        <w:spacing w:after="0" w:line="360" w:lineRule="auto"/>
-        <w:jc w:val="both"/>
-        <w:rPr>
-          <w:rFonts w:ascii="Arial" w:hAnsi="Arial" w:cs="Arial"/>
-          <w:sz w:val="24"/>
-          <w:szCs w:val="24"/>
-        </w:rPr>
-      </w:pPr>
-      <w:r>
-        <w:rPr>
-          <w:rFonts w:ascii="Arial" w:hAnsi="Arial" w:cs="Arial"/>
-          <w:sz w:val="24"/>
-          <w:szCs w:val="24"/>
-        </w:rPr>
-        <w:t xml:space="preserve">Segundo o historiador Américo Villela, um dos papéis da disciplina de História no Ensino Médio é “qualificar o aluno para entender a realidade social que ele vive e atuar como agente de transformação dessa realidade social” (informação verbal) ¹. Nesse sentido, o ensino de História ultrapassa a transmissão de acontecimentos do passado, uma vez que </w:t>
+        <w:t>1</w:t>
+      </w:r>
+      <w:r>
+        <w:rPr>
+          <w:rFonts w:ascii="Arial" w:hAnsi="Arial" w:cs="Arial"/>
+          <w:b/>
+          <w:sz w:val="24"/>
+          <w:szCs w:val="24"/>
+        </w:rPr>
+        <w:t>.</w:t>
+      </w:r>
+      <w:r>
+        <w:rPr>
+          <w:rFonts w:ascii="Arial" w:hAnsi="Arial" w:cs="Arial"/>
+          <w:b/>
+          <w:sz w:val="24"/>
+          <w:szCs w:val="24"/>
+        </w:rPr>
+        <w:t xml:space="preserve"> INTRODUÇÃO</w:t>
+      </w:r>
+    </w:p>
+    <w:p>
+      <w:pPr>
+        <w:tabs>
+          <w:tab w:val="left" w:pos="650"/>
+        </w:tabs>
+        <w:spacing w:after="0" w:line="360" w:lineRule="auto"/>
+        <w:rPr>
+          <w:rFonts w:ascii="Arial" w:hAnsi="Arial" w:cs="Arial"/>
+          <w:sz w:val="24"/>
+          <w:szCs w:val="24"/>
+        </w:rPr>
+      </w:pPr>
+    </w:p>
+    <w:p>
+      <w:pPr>
+        <w:spacing w:after="0" w:line="360" w:lineRule="auto"/>
+        <w:jc w:val="both"/>
+        <w:rPr>
+          <w:rFonts w:ascii="Arial" w:hAnsi="Arial" w:cs="Arial"/>
+          <w:sz w:val="24"/>
+          <w:szCs w:val="24"/>
+        </w:rPr>
+      </w:pPr>
+      <w:r>
+        <w:rPr>
+          <w:rFonts w:ascii="Arial" w:hAnsi="Arial" w:cs="Arial"/>
+          <w:sz w:val="24"/>
+          <w:szCs w:val="24"/>
+        </w:rPr>
+        <w:t xml:space="preserve">Segundo o historiador Américo Villela, um dos papéis da disciplina de História no Ensino Médio é “qualificar o aluno para entender a realidade social que ele vive e atuar como agente de transformação dessa realidade social” (informação verbal) ¹. Nesse </w:t>
       </w:r>
       <w:r>
         <w:rPr>
@@ -555,26 +575,98 @@
           <w:szCs w:val="24"/>
         </w:rPr>
         <w:lastRenderedPageBreak/>
-        <w:t>a compreensão dos processos históricos possibilita aos indivíduos interpretar criticamente a realidade em que estão inseridos e refletir sobre as transformações sociais. A compreensão da dinâmica social e de sua construção histórica, portanto, pode contribuir para a formação de indivíduos capazes de analisar diferentes perspectivas e participar ativamente da sociedade.</w:t>
-      </w:r>
-    </w:p>
-    <w:p>
-      <w:pPr>
-        <w:spacing w:after="0" w:line="360" w:lineRule="auto"/>
-        <w:jc w:val="both"/>
-        <w:rPr>
-          <w:rFonts w:ascii="Arial" w:hAnsi="Arial" w:cs="Arial"/>
-          <w:sz w:val="24"/>
-          <w:szCs w:val="24"/>
-        </w:rPr>
-      </w:pPr>
-      <w:r>
-        <w:rPr>
-          <w:rFonts w:ascii="Arial" w:hAnsi="Arial" w:cs="Arial"/>
-          <w:sz w:val="24"/>
-          <w:szCs w:val="24"/>
-        </w:rPr>
-        <w:t>Além disso, o contato com diferentes culturas, movimentos sociais e acontecimentos históricos pode favorecer o desenvolvimento da empatia, do respeito à diversidade e da reflexão sobre questões relacionadas à igualdade e à discriminação (UBES, ano). Dessa forma, o ensino de História apresenta potencial não apenas para a aquisição de conhecimentos sobre o passado, mas também para o desenvolvimento do pensamento crítico e da compreensão da diversidade social e cultural.</w:t>
+        <w:t>sentido, o ensino de História ultrapassa a transmissão de acontecimentos do passado, uma vez que a compreensão dos processos históricos possibilita aos indivíduos interpretar criticamente a realidade em que estão inseridos e refletir sobre as transformações sociais. A compreensão da dinâmica social e de sua construção histórica, portanto, pode contribuir para a formação de indivíduos capazes de analisar diferentes perspectivas e participar ativamente da sociedade.</w:t>
+      </w:r>
+    </w:p>
+    <w:p>
+      <w:pPr>
+        <w:spacing w:after="0" w:line="360" w:lineRule="auto"/>
+        <w:jc w:val="both"/>
+        <w:rPr>
+          <w:rFonts w:ascii="Arial" w:hAnsi="Arial" w:cs="Arial"/>
+          <w:sz w:val="24"/>
+          <w:szCs w:val="24"/>
+        </w:rPr>
+      </w:pPr>
+      <w:r>
+        <w:rPr>
+          <w:rFonts w:ascii="Arial" w:hAnsi="Arial" w:cs="Arial"/>
+          <w:sz w:val="24"/>
+          <w:szCs w:val="24"/>
+        </w:rPr>
+        <w:t xml:space="preserve">Além disso, o contato com diferentes culturas, movimentos sociais e acontecimentos históricos pode favorecer o desenvolvimento da empatia, do respeito à diversidade e da reflexão sobre questões relacionadas à igualdade e à discriminação (UBES, </w:t>
+      </w:r>
+      <w:r>
+        <w:rPr>
+          <w:rFonts w:ascii="Arial" w:hAnsi="Arial" w:cs="Arial"/>
+          <w:sz w:val="24"/>
+          <w:szCs w:val="24"/>
+        </w:rPr>
+        <w:t>2024</w:t>
+      </w:r>
+      <w:r>
+        <w:rPr>
+          <w:rFonts w:ascii="Arial" w:hAnsi="Arial" w:cs="Arial"/>
+          <w:sz w:val="24"/>
+          <w:szCs w:val="24"/>
+        </w:rPr>
+        <w:t xml:space="preserve">). Dessa forma, </w:t>
+      </w:r>
+      <w:r>
+        <w:rPr>
+          <w:rFonts w:ascii="Arial" w:hAnsi="Arial" w:cs="Arial"/>
+          <w:sz w:val="24"/>
+          <w:szCs w:val="24"/>
+        </w:rPr>
+        <w:t xml:space="preserve">o estudo de História é </w:t>
+      </w:r>
+      <w:r>
+        <w:rPr>
+          <w:rFonts w:ascii="Arial" w:hAnsi="Arial" w:cs="Arial"/>
+          <w:sz w:val="24"/>
+          <w:szCs w:val="24"/>
+        </w:rPr>
+        <w:t>de suma importância</w:t>
+      </w:r>
+      <w:r>
+        <w:rPr>
+          <w:rFonts w:ascii="Arial" w:hAnsi="Arial" w:cs="Arial"/>
+          <w:sz w:val="24"/>
+          <w:szCs w:val="24"/>
+        </w:rPr>
+        <w:t xml:space="preserve"> para a </w:t>
+      </w:r>
+      <w:r>
+        <w:rPr>
+          <w:rFonts w:ascii="Arial" w:hAnsi="Arial" w:cs="Arial"/>
+          <w:sz w:val="24"/>
+          <w:szCs w:val="24"/>
+        </w:rPr>
+        <w:t>sociedade</w:t>
+      </w:r>
+      <w:r>
+        <w:rPr>
+          <w:rFonts w:ascii="Arial" w:hAnsi="Arial" w:cs="Arial"/>
+          <w:sz w:val="24"/>
+          <w:szCs w:val="24"/>
+        </w:rPr>
+        <w:t xml:space="preserve"> brasileira, haja visto, que é constituída por culturas de diversos povos, que precisam ser entendidas corretamente para serem </w:t>
+      </w:r>
+      <w:r>
+        <w:rPr>
+          <w:rFonts w:ascii="Arial" w:hAnsi="Arial" w:cs="Arial"/>
+          <w:sz w:val="24"/>
+          <w:szCs w:val="24"/>
+        </w:rPr>
+        <w:t xml:space="preserve">devidamente </w:t>
+      </w:r>
+      <w:r>
+        <w:rPr>
+          <w:rFonts w:ascii="Arial" w:hAnsi="Arial" w:cs="Arial"/>
+          <w:sz w:val="24"/>
+          <w:szCs w:val="24"/>
+        </w:rPr>
+        <w:t>respeitadas.</w:t>
       </w:r>
     </w:p>
     <w:p>
@@ -612,81 +704,792 @@
           <w:sz w:val="24"/>
           <w:szCs w:val="24"/>
         </w:rPr>
-        <w:t>Diante disso, este trabalho tem como objetivo desenvolver o Historiando, um jogo digital educativo voltado ao ensino da História do Brasil nos períodos pré-colonial e colonial, utilizando uma abordagem lúdica e imersiva. A proposta busca valorizar os povos originários, contextualizar os processos históricos e incorporar uma perspectiva decolonial à experiência de aprendizagem.</w:t>
-      </w:r>
-    </w:p>
-    <w:p>
-      <w:pPr>
-        <w:spacing w:after="0" w:line="360" w:lineRule="auto"/>
-        <w:jc w:val="both"/>
-        <w:rPr>
-          <w:rFonts w:ascii="Arial" w:hAnsi="Arial" w:cs="Arial"/>
-          <w:sz w:val="24"/>
-          <w:szCs w:val="24"/>
-        </w:rPr>
-      </w:pPr>
-    </w:p>
-    <w:p>
-      <w:pPr>
-        <w:spacing w:after="0" w:line="360" w:lineRule="auto"/>
-        <w:jc w:val="both"/>
-        <w:rPr>
-          <w:rFonts w:ascii="Arial" w:hAnsi="Arial" w:cs="Arial"/>
-          <w:sz w:val="24"/>
-          <w:szCs w:val="24"/>
-        </w:rPr>
-      </w:pPr>
-    </w:p>
-    <w:p>
-      <w:pPr>
-        <w:spacing w:after="0" w:line="360" w:lineRule="auto"/>
-        <w:jc w:val="both"/>
-        <w:rPr>
-          <w:rFonts w:ascii="Arial" w:hAnsi="Arial" w:cs="Arial"/>
-          <w:sz w:val="24"/>
-          <w:szCs w:val="24"/>
-        </w:rPr>
-      </w:pPr>
-    </w:p>
-    <w:p>
-      <w:pPr>
-        <w:spacing w:after="0" w:line="360" w:lineRule="auto"/>
-        <w:jc w:val="both"/>
-        <w:rPr>
-          <w:rFonts w:ascii="Arial" w:hAnsi="Arial" w:cs="Arial"/>
-          <w:sz w:val="24"/>
-          <w:szCs w:val="24"/>
-        </w:rPr>
-      </w:pPr>
-    </w:p>
-    <w:p>
-      <w:pPr>
-        <w:spacing w:after="0" w:line="360" w:lineRule="auto"/>
-        <w:jc w:val="both"/>
-        <w:rPr>
-          <w:rFonts w:ascii="Arial" w:hAnsi="Arial" w:cs="Arial"/>
-          <w:sz w:val="24"/>
-          <w:szCs w:val="24"/>
-        </w:rPr>
-      </w:pPr>
-    </w:p>
-    <w:p>
-      <w:pPr>
-        <w:spacing w:after="0" w:line="360" w:lineRule="auto"/>
-        <w:jc w:val="both"/>
-        <w:rPr>
-          <w:rFonts w:ascii="Arial" w:hAnsi="Arial" w:cs="Arial"/>
-          <w:sz w:val="24"/>
-          <w:szCs w:val="24"/>
-        </w:rPr>
-      </w:pPr>
-    </w:p>
-    <w:p>
-      <w:pPr>
-        <w:spacing w:after="0" w:line="360" w:lineRule="auto"/>
-        <w:jc w:val="both"/>
-        <w:rPr>
-          <w:rFonts w:ascii="Arial" w:hAnsi="Arial" w:cs="Arial"/>
+        <w:t>Diante disso, neste artigo apresentamos quais impactos positivos jogos digitais podem ter no aprendizado</w:t>
+      </w:r>
+      <w:r>
+        <w:rPr>
+          <w:rFonts w:ascii="Arial" w:hAnsi="Arial" w:cs="Arial"/>
+          <w:sz w:val="24"/>
+          <w:szCs w:val="24"/>
+        </w:rPr>
+        <w:t xml:space="preserve"> da História do Brasil</w:t>
+      </w:r>
+      <w:r>
+        <w:rPr>
+          <w:rFonts w:ascii="Arial" w:hAnsi="Arial" w:cs="Arial"/>
+          <w:sz w:val="24"/>
+          <w:szCs w:val="24"/>
+        </w:rPr>
+        <w:t xml:space="preserve"> e </w:t>
+      </w:r>
+      <w:r>
+        <w:rPr>
+          <w:rFonts w:ascii="Arial" w:hAnsi="Arial" w:cs="Arial"/>
+          <w:sz w:val="24"/>
+          <w:szCs w:val="24"/>
+        </w:rPr>
+        <w:t xml:space="preserve">como utilizar tecnologias de GameDev (desenvolvimento de jogos) para a construção de </w:t>
+      </w:r>
+      <w:r>
+        <w:rPr>
+          <w:rFonts w:ascii="Arial" w:hAnsi="Arial" w:cs="Arial"/>
+          <w:sz w:val="24"/>
+          <w:szCs w:val="24"/>
+        </w:rPr>
+        <w:t>um serious game</w:t>
+      </w:r>
+      <w:r>
+        <w:rPr>
+          <w:rFonts w:ascii="Arial" w:hAnsi="Arial" w:cs="Arial"/>
+          <w:sz w:val="24"/>
+          <w:szCs w:val="24"/>
+        </w:rPr>
+        <w:t xml:space="preserve"> (</w:t>
+      </w:r>
+      <w:r>
+        <w:rPr>
+          <w:rFonts w:ascii="Arial" w:hAnsi="Arial" w:cs="Arial"/>
+          <w:sz w:val="24"/>
+          <w:szCs w:val="24"/>
+        </w:rPr>
+        <w:t>jogo</w:t>
+      </w:r>
+      <w:r>
+        <w:rPr>
+          <w:rFonts w:ascii="Arial" w:hAnsi="Arial" w:cs="Arial"/>
+          <w:sz w:val="24"/>
+          <w:szCs w:val="24"/>
+        </w:rPr>
+        <w:t xml:space="preserve"> sérios)</w:t>
+      </w:r>
+      <w:r>
+        <w:rPr>
+          <w:rFonts w:ascii="Arial" w:hAnsi="Arial" w:cs="Arial"/>
+          <w:sz w:val="24"/>
+          <w:szCs w:val="24"/>
+        </w:rPr>
+        <w:t xml:space="preserve">. </w:t>
+      </w:r>
+    </w:p>
+    <w:p>
+      <w:pPr>
+        <w:spacing w:after="0" w:line="360" w:lineRule="auto"/>
+        <w:jc w:val="both"/>
+        <w:rPr>
+          <w:rFonts w:ascii="Arial" w:hAnsi="Arial" w:cs="Arial"/>
+          <w:sz w:val="24"/>
+          <w:szCs w:val="24"/>
+        </w:rPr>
+      </w:pPr>
+    </w:p>
+    <w:p>
+      <w:pPr>
+        <w:spacing w:after="0" w:line="360" w:lineRule="auto"/>
+        <w:jc w:val="both"/>
+        <w:rPr>
+          <w:rFonts w:ascii="Arial" w:hAnsi="Arial" w:cs="Arial"/>
+          <w:b/>
+          <w:sz w:val="24"/>
+          <w:szCs w:val="24"/>
+        </w:rPr>
+      </w:pPr>
+      <w:r>
+        <w:rPr>
+          <w:rFonts w:ascii="Arial" w:hAnsi="Arial" w:cs="Arial"/>
+          <w:b/>
+          <w:sz w:val="24"/>
+          <w:szCs w:val="24"/>
+        </w:rPr>
+        <w:t xml:space="preserve">2. </w:t>
+      </w:r>
+      <w:r>
+        <w:rPr>
+          <w:rFonts w:ascii="Arial" w:hAnsi="Arial" w:cs="Arial"/>
+          <w:b/>
+          <w:sz w:val="24"/>
+          <w:szCs w:val="24"/>
+        </w:rPr>
+        <w:t>O ENSINO DA</w:t>
+      </w:r>
+      <w:r>
+        <w:rPr>
+          <w:rFonts w:ascii="Arial" w:hAnsi="Arial" w:cs="Arial"/>
+          <w:b/>
+          <w:sz w:val="24"/>
+          <w:szCs w:val="24"/>
+        </w:rPr>
+        <w:t xml:space="preserve"> HISTÓRIA</w:t>
+      </w:r>
+      <w:r>
+        <w:rPr>
+          <w:rFonts w:ascii="Arial" w:hAnsi="Arial" w:cs="Arial"/>
+          <w:b/>
+          <w:sz w:val="24"/>
+          <w:szCs w:val="24"/>
+        </w:rPr>
+        <w:t xml:space="preserve"> DO BRASI</w:t>
+      </w:r>
+      <w:r>
+        <w:rPr>
+          <w:rFonts w:ascii="Arial" w:hAnsi="Arial" w:cs="Arial"/>
+          <w:b/>
+          <w:sz w:val="24"/>
+          <w:szCs w:val="24"/>
+        </w:rPr>
+        <w:t xml:space="preserve">L </w:t>
+      </w:r>
+      <w:r>
+        <w:rPr>
+          <w:rFonts w:ascii="Arial" w:hAnsi="Arial" w:cs="Arial"/>
+          <w:b/>
+          <w:sz w:val="24"/>
+          <w:szCs w:val="24"/>
+        </w:rPr>
+        <w:t>NO DECORRER DO TEMPO</w:t>
+      </w:r>
+    </w:p>
+    <w:p>
+      <w:pPr>
+        <w:spacing w:after="0" w:line="360" w:lineRule="auto"/>
+        <w:jc w:val="both"/>
+        <w:rPr>
+          <w:rFonts w:ascii="Arial" w:hAnsi="Arial" w:cs="Arial"/>
+          <w:b/>
+          <w:sz w:val="24"/>
+          <w:szCs w:val="24"/>
+        </w:rPr>
+      </w:pPr>
+    </w:p>
+    <w:p>
+      <w:pPr>
+        <w:spacing w:after="0" w:line="360" w:lineRule="auto"/>
+        <w:jc w:val="both"/>
+        <w:rPr>
+          <w:rFonts w:ascii="Arial" w:hAnsi="Arial" w:cs="Arial"/>
+          <w:sz w:val="24"/>
+          <w:szCs w:val="24"/>
+        </w:rPr>
+      </w:pPr>
+      <w:r>
+        <w:rPr>
+          <w:rFonts w:ascii="Arial" w:hAnsi="Arial" w:cs="Arial"/>
+          <w:sz w:val="24"/>
+          <w:szCs w:val="24"/>
+        </w:rPr>
+        <w:t>Os períodos que impactaram significativamente o ensino da História do Brasil f</w:t>
+      </w:r>
+      <w:r>
+        <w:rPr>
+          <w:rFonts w:ascii="Arial" w:hAnsi="Arial" w:cs="Arial"/>
+          <w:sz w:val="24"/>
+          <w:szCs w:val="24"/>
+        </w:rPr>
+        <w:t>oram Império</w:t>
+      </w:r>
+      <w:r>
+        <w:rPr>
+          <w:rFonts w:ascii="Arial" w:hAnsi="Arial" w:cs="Arial"/>
+          <w:sz w:val="24"/>
+          <w:szCs w:val="24"/>
+        </w:rPr>
+        <w:t xml:space="preserve">, </w:t>
+      </w:r>
+      <w:r>
+        <w:rPr>
+          <w:rFonts w:ascii="Arial" w:hAnsi="Arial" w:cs="Arial"/>
+          <w:sz w:val="24"/>
+          <w:szCs w:val="24"/>
+        </w:rPr>
+        <w:t xml:space="preserve">República e </w:t>
+      </w:r>
+      <w:r>
+        <w:rPr>
+          <w:rFonts w:ascii="Arial" w:hAnsi="Arial" w:cs="Arial"/>
+          <w:sz w:val="24"/>
+          <w:szCs w:val="24"/>
+        </w:rPr>
+        <w:t xml:space="preserve">Ditadura Militar, eles tiveram suas particularidades, mas um ponto em comum </w:t>
+      </w:r>
+      <w:r>
+        <w:rPr>
+          <w:rFonts w:ascii="Arial" w:hAnsi="Arial" w:cs="Arial"/>
+          <w:sz w:val="24"/>
+          <w:szCs w:val="24"/>
+        </w:rPr>
+        <w:t>entre os três</w:t>
+      </w:r>
+      <w:r>
+        <w:rPr>
+          <w:rFonts w:ascii="Arial" w:hAnsi="Arial" w:cs="Arial"/>
+          <w:sz w:val="24"/>
+          <w:szCs w:val="24"/>
+        </w:rPr>
+        <w:t xml:space="preserve"> </w:t>
+      </w:r>
+      <w:r>
+        <w:rPr>
+          <w:rFonts w:ascii="Arial" w:hAnsi="Arial" w:cs="Arial"/>
+          <w:sz w:val="24"/>
+          <w:szCs w:val="24"/>
+        </w:rPr>
+        <w:t xml:space="preserve">foi </w:t>
+      </w:r>
+      <w:r>
+        <w:rPr>
+          <w:rFonts w:ascii="Arial" w:hAnsi="Arial" w:cs="Arial"/>
+          <w:sz w:val="24"/>
+          <w:szCs w:val="24"/>
+        </w:rPr>
+        <w:t>a utilização d</w:t>
+      </w:r>
+      <w:r>
+        <w:rPr>
+          <w:rFonts w:ascii="Arial" w:hAnsi="Arial" w:cs="Arial"/>
+          <w:sz w:val="24"/>
+          <w:szCs w:val="24"/>
+        </w:rPr>
+        <w:t>essa disciplina para</w:t>
+      </w:r>
+      <w:r>
+        <w:rPr>
+          <w:rFonts w:ascii="Arial" w:hAnsi="Arial" w:cs="Arial"/>
+          <w:sz w:val="24"/>
+          <w:szCs w:val="24"/>
+        </w:rPr>
+        <w:t xml:space="preserve"> alcançar</w:t>
+      </w:r>
+      <w:r>
+        <w:rPr>
+          <w:rFonts w:ascii="Arial" w:hAnsi="Arial" w:cs="Arial"/>
+          <w:sz w:val="24"/>
+          <w:szCs w:val="24"/>
+        </w:rPr>
+        <w:t xml:space="preserve"> de forma sútil os interesses das </w:t>
+      </w:r>
+      <w:r>
+        <w:rPr>
+          <w:rFonts w:ascii="Arial" w:hAnsi="Arial" w:cs="Arial"/>
+          <w:sz w:val="24"/>
+          <w:szCs w:val="24"/>
+        </w:rPr>
+        <w:t>classes</w:t>
+      </w:r>
+      <w:r>
+        <w:rPr>
+          <w:rFonts w:ascii="Arial" w:hAnsi="Arial" w:cs="Arial"/>
+          <w:sz w:val="24"/>
+          <w:szCs w:val="24"/>
+        </w:rPr>
+        <w:t xml:space="preserve"> dominantes</w:t>
+      </w:r>
+      <w:r>
+        <w:rPr>
+          <w:rFonts w:ascii="Arial" w:hAnsi="Arial" w:cs="Arial"/>
+          <w:sz w:val="24"/>
+          <w:szCs w:val="24"/>
+        </w:rPr>
+        <w:t>.</w:t>
+      </w:r>
+    </w:p>
+    <w:p>
+      <w:pPr>
+        <w:spacing w:after="0" w:line="360" w:lineRule="auto"/>
+        <w:jc w:val="both"/>
+        <w:rPr>
+          <w:rFonts w:ascii="Arial" w:hAnsi="Arial" w:cs="Arial"/>
+          <w:sz w:val="24"/>
+          <w:szCs w:val="24"/>
+        </w:rPr>
+      </w:pPr>
+      <w:r>
+        <w:rPr>
+          <w:rFonts w:ascii="Arial" w:hAnsi="Arial" w:cs="Arial"/>
+          <w:sz w:val="24"/>
+          <w:szCs w:val="24"/>
+        </w:rPr>
+        <w:t xml:space="preserve">Em </w:t>
+      </w:r>
+      <w:r>
+        <w:rPr>
+          <w:rFonts w:ascii="Arial" w:hAnsi="Arial" w:cs="Arial"/>
+          <w:i/>
+          <w:sz w:val="24"/>
+          <w:szCs w:val="24"/>
+        </w:rPr>
+        <w:t xml:space="preserve">Um breve histórico sobre o ensino de História no Brasil, </w:t>
+      </w:r>
+      <w:r>
+        <w:rPr>
+          <w:rFonts w:ascii="Arial" w:hAnsi="Arial" w:cs="Arial"/>
+          <w:sz w:val="24"/>
+          <w:szCs w:val="24"/>
+        </w:rPr>
+        <w:t>Adriana de Carvalho Medeiros</w:t>
+      </w:r>
+      <w:r>
+        <w:rPr>
+          <w:rFonts w:ascii="Arial" w:hAnsi="Arial" w:cs="Arial"/>
+          <w:sz w:val="24"/>
+          <w:szCs w:val="24"/>
+        </w:rPr>
+        <w:t>, expõem</w:t>
+      </w:r>
+      <w:r>
+        <w:rPr>
+          <w:rFonts w:ascii="Arial" w:hAnsi="Arial" w:cs="Arial"/>
+          <w:sz w:val="24"/>
+          <w:szCs w:val="24"/>
+        </w:rPr>
+        <w:t xml:space="preserve"> como era educação brasileira no período imperial: </w:t>
+      </w:r>
+    </w:p>
+    <w:p>
+      <w:pPr>
+        <w:spacing w:after="0" w:line="360" w:lineRule="auto"/>
+        <w:jc w:val="both"/>
+        <w:rPr>
+          <w:rFonts w:ascii="Arial" w:hAnsi="Arial" w:cs="Arial"/>
+          <w:sz w:val="24"/>
+          <w:szCs w:val="24"/>
+        </w:rPr>
+      </w:pPr>
+    </w:p>
+    <w:p>
+      <w:pPr>
+        <w:spacing w:after="0" w:line="240" w:lineRule="auto"/>
+        <w:ind w:left="2268"/>
+        <w:jc w:val="both"/>
+        <w:rPr>
+          <w:rFonts w:ascii="Arial" w:hAnsi="Arial" w:cs="Arial"/>
+          <w:sz w:val="20"/>
+          <w:szCs w:val="20"/>
+        </w:rPr>
+      </w:pPr>
+      <w:r>
+        <w:rPr>
+          <w:rFonts w:ascii="Arial" w:hAnsi="Arial" w:cs="Arial"/>
+          <w:sz w:val="20"/>
+          <w:szCs w:val="20"/>
+        </w:rPr>
+        <w:t xml:space="preserve">Podemos aferir que a educação brasileira ao longo deste período, pode ser identificada pelo seu caráter elitista e propedêutico, sendo as escassas escolas, atreladas ao Estado sem autonomia em relação à escolha dos </w:t>
+      </w:r>
+      <w:r>
+        <w:rPr>
+          <w:rFonts w:ascii="Arial" w:hAnsi="Arial" w:cs="Arial"/>
+          <w:sz w:val="20"/>
+          <w:szCs w:val="20"/>
+        </w:rPr>
+        <w:lastRenderedPageBreak/>
+        <w:t>conteúdos. Foram ainda influenciados pelas doutrinas religiosas que formaram durante os primeiros séculos de colonização, a base da educação brasileira, devido ao monopólio jesuítico em relação à educação colonial, o que não garantiu uma emancipação do pensamento e da cultura brasileira ao que se refere à herança europeia.</w:t>
+      </w:r>
+      <w:r>
+        <w:rPr>
+          <w:rFonts w:ascii="Arial" w:hAnsi="Arial" w:cs="Arial"/>
+          <w:sz w:val="20"/>
+          <w:szCs w:val="20"/>
+        </w:rPr>
+        <w:t xml:space="preserve"> (MEDEIROS, 2021, p.8)</w:t>
+      </w:r>
+      <w:r>
+        <w:rPr>
+          <w:rFonts w:ascii="Arial" w:hAnsi="Arial" w:cs="Arial"/>
+          <w:sz w:val="20"/>
+          <w:szCs w:val="20"/>
+        </w:rPr>
+        <w:tab/>
+      </w:r>
+    </w:p>
+    <w:p>
+      <w:pPr>
+        <w:spacing w:after="0" w:line="240" w:lineRule="auto"/>
+        <w:ind w:left="2268"/>
+        <w:jc w:val="both"/>
+        <w:rPr>
+          <w:rFonts w:ascii="Arial" w:hAnsi="Arial" w:cs="Arial"/>
+          <w:sz w:val="20"/>
+          <w:szCs w:val="20"/>
+        </w:rPr>
+      </w:pPr>
+    </w:p>
+    <w:p>
+      <w:pPr>
+        <w:spacing w:after="0" w:line="360" w:lineRule="auto"/>
+        <w:jc w:val="both"/>
+        <w:rPr>
+          <w:rFonts w:ascii="Arial" w:hAnsi="Arial" w:cs="Arial"/>
+          <w:sz w:val="24"/>
+          <w:szCs w:val="24"/>
+        </w:rPr>
+      </w:pPr>
+      <w:proofErr w:type="gramStart"/>
+      <w:r>
+        <w:rPr>
+          <w:rFonts w:ascii="Arial" w:hAnsi="Arial" w:cs="Arial"/>
+          <w:sz w:val="24"/>
+          <w:szCs w:val="24"/>
+        </w:rPr>
+        <w:t>h</w:t>
+      </w:r>
+      <w:proofErr w:type="gramEnd"/>
+    </w:p>
+    <w:p>
+      <w:pPr>
+        <w:spacing w:after="0" w:line="240" w:lineRule="auto"/>
+        <w:ind w:left="2268"/>
+        <w:jc w:val="both"/>
+        <w:rPr>
+          <w:rFonts w:ascii="Arial" w:hAnsi="Arial" w:cs="Arial"/>
+          <w:sz w:val="20"/>
+          <w:szCs w:val="20"/>
+        </w:rPr>
+      </w:pPr>
+    </w:p>
+    <w:p>
+      <w:pPr>
+        <w:spacing w:after="0" w:line="240" w:lineRule="auto"/>
+        <w:ind w:left="2268"/>
+        <w:jc w:val="both"/>
+        <w:rPr>
+          <w:rFonts w:ascii="Arial" w:hAnsi="Arial" w:cs="Arial"/>
+          <w:sz w:val="20"/>
+          <w:szCs w:val="20"/>
+        </w:rPr>
+      </w:pPr>
+      <w:r>
+        <w:rPr>
+          <w:rFonts w:ascii="Arial" w:hAnsi="Arial" w:cs="Arial"/>
+          <w:sz w:val="20"/>
+          <w:szCs w:val="20"/>
+        </w:rPr>
+        <w:tab/>
+      </w:r>
+      <w:r>
+        <w:rPr>
+          <w:rFonts w:ascii="Arial" w:hAnsi="Arial" w:cs="Arial"/>
+          <w:sz w:val="20"/>
+          <w:szCs w:val="20"/>
+        </w:rPr>
+        <w:tab/>
+      </w:r>
+    </w:p>
+    <w:p>
+      <w:pPr>
+        <w:spacing w:after="0" w:line="360" w:lineRule="auto"/>
+        <w:jc w:val="both"/>
+        <w:rPr>
+          <w:rFonts w:ascii="Arial" w:hAnsi="Arial" w:cs="Arial"/>
+          <w:sz w:val="24"/>
+          <w:szCs w:val="24"/>
+        </w:rPr>
+      </w:pPr>
+    </w:p>
+    <w:p>
+      <w:pPr>
+        <w:spacing w:after="0" w:line="360" w:lineRule="auto"/>
+        <w:jc w:val="both"/>
+        <w:rPr>
+          <w:rFonts w:ascii="Arial" w:hAnsi="Arial" w:cs="Arial"/>
+          <w:b/>
+          <w:sz w:val="24"/>
+          <w:szCs w:val="24"/>
+        </w:rPr>
+      </w:pPr>
+    </w:p>
+    <w:p>
+      <w:pPr>
+        <w:spacing w:after="0" w:line="360" w:lineRule="auto"/>
+        <w:jc w:val="both"/>
+        <w:rPr>
+          <w:rFonts w:ascii="Arial" w:hAnsi="Arial" w:cs="Arial"/>
+          <w:b/>
+          <w:sz w:val="24"/>
+          <w:szCs w:val="24"/>
+        </w:rPr>
+      </w:pPr>
+    </w:p>
+    <w:p>
+      <w:pPr>
+        <w:spacing w:after="0" w:line="360" w:lineRule="auto"/>
+        <w:jc w:val="both"/>
+        <w:rPr>
+          <w:rFonts w:ascii="Arial" w:hAnsi="Arial" w:cs="Arial"/>
+          <w:b/>
+          <w:sz w:val="24"/>
+          <w:szCs w:val="24"/>
+        </w:rPr>
+      </w:pPr>
+    </w:p>
+    <w:p>
+      <w:pPr>
+        <w:spacing w:after="0" w:line="360" w:lineRule="auto"/>
+        <w:jc w:val="both"/>
+        <w:rPr>
+          <w:rFonts w:ascii="Arial" w:hAnsi="Arial" w:cs="Arial"/>
+          <w:b/>
+          <w:sz w:val="24"/>
+          <w:szCs w:val="24"/>
+        </w:rPr>
+      </w:pPr>
+    </w:p>
+    <w:p>
+      <w:pPr>
+        <w:spacing w:after="0" w:line="360" w:lineRule="auto"/>
+        <w:jc w:val="both"/>
+        <w:rPr>
+          <w:rFonts w:ascii="Arial" w:hAnsi="Arial" w:cs="Arial"/>
+          <w:b/>
+          <w:sz w:val="24"/>
+          <w:szCs w:val="24"/>
+        </w:rPr>
+      </w:pPr>
+    </w:p>
+    <w:p>
+      <w:pPr>
+        <w:spacing w:after="0" w:line="360" w:lineRule="auto"/>
+        <w:jc w:val="both"/>
+        <w:rPr>
+          <w:rFonts w:ascii="Arial" w:hAnsi="Arial" w:cs="Arial"/>
+          <w:b/>
+          <w:sz w:val="24"/>
+          <w:szCs w:val="24"/>
+        </w:rPr>
+      </w:pPr>
+    </w:p>
+    <w:p>
+      <w:pPr>
+        <w:spacing w:after="0" w:line="360" w:lineRule="auto"/>
+        <w:jc w:val="both"/>
+        <w:rPr>
+          <w:rFonts w:ascii="Arial" w:hAnsi="Arial" w:cs="Arial"/>
+          <w:b/>
+          <w:sz w:val="24"/>
+          <w:szCs w:val="24"/>
+        </w:rPr>
+      </w:pPr>
+    </w:p>
+    <w:p>
+      <w:pPr>
+        <w:spacing w:after="0" w:line="360" w:lineRule="auto"/>
+        <w:jc w:val="both"/>
+        <w:rPr>
+          <w:rFonts w:ascii="Arial" w:hAnsi="Arial" w:cs="Arial"/>
+          <w:b/>
+          <w:sz w:val="24"/>
+          <w:szCs w:val="24"/>
+        </w:rPr>
+      </w:pPr>
+    </w:p>
+    <w:p>
+      <w:pPr>
+        <w:spacing w:after="0" w:line="360" w:lineRule="auto"/>
+        <w:jc w:val="both"/>
+        <w:rPr>
+          <w:rFonts w:ascii="Arial" w:hAnsi="Arial" w:cs="Arial"/>
+          <w:b/>
+          <w:sz w:val="24"/>
+          <w:szCs w:val="24"/>
+        </w:rPr>
+      </w:pPr>
+    </w:p>
+    <w:p>
+      <w:pPr>
+        <w:spacing w:after="0" w:line="360" w:lineRule="auto"/>
+        <w:jc w:val="both"/>
+        <w:rPr>
+          <w:rFonts w:ascii="Arial" w:hAnsi="Arial" w:cs="Arial"/>
+          <w:b/>
+          <w:sz w:val="24"/>
+          <w:szCs w:val="24"/>
+        </w:rPr>
+      </w:pPr>
+    </w:p>
+    <w:p>
+      <w:pPr>
+        <w:spacing w:after="0" w:line="360" w:lineRule="auto"/>
+        <w:jc w:val="both"/>
+        <w:rPr>
+          <w:rFonts w:ascii="Arial" w:hAnsi="Arial" w:cs="Arial"/>
+          <w:b/>
+          <w:sz w:val="24"/>
+          <w:szCs w:val="24"/>
+        </w:rPr>
+      </w:pPr>
+    </w:p>
+    <w:p>
+      <w:pPr>
+        <w:spacing w:after="0" w:line="360" w:lineRule="auto"/>
+        <w:jc w:val="both"/>
+        <w:rPr>
+          <w:rFonts w:ascii="Arial" w:hAnsi="Arial" w:cs="Arial"/>
+          <w:b/>
+          <w:sz w:val="24"/>
+          <w:szCs w:val="24"/>
+        </w:rPr>
+      </w:pPr>
+    </w:p>
+    <w:p>
+      <w:pPr>
+        <w:spacing w:after="0" w:line="360" w:lineRule="auto"/>
+        <w:jc w:val="both"/>
+        <w:rPr>
+          <w:rFonts w:ascii="Arial" w:hAnsi="Arial" w:cs="Arial"/>
+          <w:b/>
+          <w:sz w:val="24"/>
+          <w:szCs w:val="24"/>
+        </w:rPr>
+      </w:pPr>
+    </w:p>
+    <w:p>
+      <w:pPr>
+        <w:spacing w:after="0" w:line="360" w:lineRule="auto"/>
+        <w:jc w:val="both"/>
+        <w:rPr>
+          <w:rFonts w:ascii="Arial" w:hAnsi="Arial" w:cs="Arial"/>
+          <w:b/>
+          <w:sz w:val="24"/>
+          <w:szCs w:val="24"/>
+        </w:rPr>
+      </w:pPr>
+    </w:p>
+    <w:p>
+      <w:pPr>
+        <w:spacing w:after="0" w:line="360" w:lineRule="auto"/>
+        <w:jc w:val="both"/>
+        <w:rPr>
+          <w:rFonts w:ascii="Arial" w:hAnsi="Arial" w:cs="Arial"/>
+          <w:b/>
+          <w:sz w:val="24"/>
+          <w:szCs w:val="24"/>
+        </w:rPr>
+      </w:pPr>
+    </w:p>
+    <w:p>
+      <w:pPr>
+        <w:spacing w:after="0" w:line="360" w:lineRule="auto"/>
+        <w:jc w:val="both"/>
+        <w:rPr>
+          <w:rFonts w:ascii="Arial" w:hAnsi="Arial" w:cs="Arial"/>
+          <w:b/>
+          <w:sz w:val="24"/>
+          <w:szCs w:val="24"/>
+        </w:rPr>
+      </w:pPr>
+    </w:p>
+    <w:p>
+      <w:pPr>
+        <w:spacing w:after="0" w:line="360" w:lineRule="auto"/>
+        <w:jc w:val="both"/>
+        <w:rPr>
+          <w:rFonts w:ascii="Arial" w:hAnsi="Arial" w:cs="Arial"/>
+          <w:b/>
+          <w:sz w:val="24"/>
+          <w:szCs w:val="24"/>
+        </w:rPr>
+      </w:pPr>
+    </w:p>
+    <w:p>
+      <w:pPr>
+        <w:spacing w:after="0" w:line="360" w:lineRule="auto"/>
+        <w:jc w:val="both"/>
+        <w:rPr>
+          <w:rFonts w:ascii="Arial" w:hAnsi="Arial" w:cs="Arial"/>
+          <w:b/>
+          <w:sz w:val="24"/>
+          <w:szCs w:val="24"/>
+        </w:rPr>
+      </w:pPr>
+    </w:p>
+    <w:p>
+      <w:pPr>
+        <w:spacing w:after="0" w:line="360" w:lineRule="auto"/>
+        <w:jc w:val="both"/>
+        <w:rPr>
+          <w:rFonts w:ascii="Arial" w:hAnsi="Arial" w:cs="Arial"/>
+          <w:b/>
+          <w:sz w:val="24"/>
+          <w:szCs w:val="24"/>
+        </w:rPr>
+      </w:pPr>
+    </w:p>
+    <w:p>
+      <w:pPr>
+        <w:spacing w:after="0" w:line="360" w:lineRule="auto"/>
+        <w:jc w:val="both"/>
+        <w:rPr>
+          <w:rFonts w:ascii="Arial" w:hAnsi="Arial" w:cs="Arial"/>
+          <w:b/>
+          <w:sz w:val="24"/>
+          <w:szCs w:val="24"/>
+        </w:rPr>
+      </w:pPr>
+    </w:p>
+    <w:p>
+      <w:pPr>
+        <w:spacing w:after="0" w:line="360" w:lineRule="auto"/>
+        <w:jc w:val="both"/>
+        <w:rPr>
+          <w:rFonts w:ascii="Arial" w:hAnsi="Arial" w:cs="Arial"/>
+          <w:b/>
+          <w:sz w:val="24"/>
+          <w:szCs w:val="24"/>
+        </w:rPr>
+      </w:pPr>
+    </w:p>
+    <w:p>
+      <w:pPr>
+        <w:spacing w:after="0" w:line="360" w:lineRule="auto"/>
+        <w:jc w:val="both"/>
+        <w:rPr>
+          <w:rFonts w:ascii="Arial" w:hAnsi="Arial" w:cs="Arial"/>
+          <w:b/>
+          <w:sz w:val="24"/>
+          <w:szCs w:val="24"/>
+        </w:rPr>
+      </w:pPr>
+    </w:p>
+    <w:p>
+      <w:pPr>
+        <w:spacing w:after="0" w:line="360" w:lineRule="auto"/>
+        <w:jc w:val="both"/>
+        <w:rPr>
+          <w:rFonts w:ascii="Arial" w:hAnsi="Arial" w:cs="Arial"/>
+          <w:b/>
+          <w:sz w:val="24"/>
+          <w:szCs w:val="24"/>
+        </w:rPr>
+      </w:pPr>
+    </w:p>
+    <w:p>
+      <w:pPr>
+        <w:spacing w:after="0" w:line="360" w:lineRule="auto"/>
+        <w:jc w:val="both"/>
+        <w:rPr>
+          <w:rFonts w:ascii="Arial" w:hAnsi="Arial" w:cs="Arial"/>
+          <w:b/>
+          <w:sz w:val="24"/>
+          <w:szCs w:val="24"/>
+        </w:rPr>
+      </w:pPr>
+    </w:p>
+    <w:p>
+      <w:pPr>
+        <w:spacing w:after="0" w:line="360" w:lineRule="auto"/>
+        <w:jc w:val="both"/>
+        <w:rPr>
+          <w:rFonts w:ascii="Arial" w:hAnsi="Arial" w:cs="Arial"/>
+          <w:b/>
+          <w:sz w:val="24"/>
+          <w:szCs w:val="24"/>
+        </w:rPr>
+      </w:pPr>
+    </w:p>
+    <w:p>
+      <w:pPr>
+        <w:spacing w:after="0" w:line="360" w:lineRule="auto"/>
+        <w:jc w:val="both"/>
+        <w:rPr>
+          <w:rFonts w:ascii="Arial" w:hAnsi="Arial" w:cs="Arial"/>
+          <w:b/>
           <w:sz w:val="24"/>
           <w:szCs w:val="24"/>
         </w:rPr>
@@ -711,17 +1514,6 @@
         <w:jc w:val="both"/>
         <w:rPr>
           <w:rFonts w:ascii="Arial" w:hAnsi="Arial" w:cs="Arial"/>
-          <w:sz w:val="24"/>
-          <w:szCs w:val="24"/>
-        </w:rPr>
-      </w:pPr>
-    </w:p>
-    <w:p>
-      <w:pPr>
-        <w:spacing w:after="0" w:line="360" w:lineRule="auto"/>
-        <w:jc w:val="both"/>
-        <w:rPr>
-          <w:rFonts w:ascii="Arial" w:hAnsi="Arial" w:cs="Arial"/>
           <w:b/>
           <w:sz w:val="24"/>
           <w:szCs w:val="24"/>
@@ -825,7 +1617,6 @@
     <w:p>
       <w:pPr>
         <w:spacing w:after="0" w:line="360" w:lineRule="auto"/>
-        <w:jc w:val="both"/>
         <w:rPr>
           <w:rFonts w:ascii="Arial" w:hAnsi="Arial" w:cs="Arial"/>
           <w:sz w:val="24"/>
@@ -844,26 +1635,40 @@
     <w:p>
       <w:pPr>
         <w:spacing w:after="0" w:line="360" w:lineRule="auto"/>
-        <w:jc w:val="both"/>
-        <w:rPr>
-          <w:rFonts w:ascii="Arial" w:hAnsi="Arial" w:cs="Arial"/>
-          <w:sz w:val="24"/>
-          <w:szCs w:val="24"/>
-        </w:rPr>
-      </w:pPr>
-      <w:r>
-        <w:rPr>
-          <w:rFonts w:ascii="Arial" w:hAnsi="Arial" w:cs="Arial"/>
-          <w:sz w:val="24"/>
-          <w:szCs w:val="24"/>
-        </w:rPr>
-        <w:t>GAMEFIC. O que é gamificação? O guia definitivo. [S. l.], [s. d.]. Disponível em: https://www.gamefic.me/blog/o-que-e-gamificacao-o-guia-definitivo/. Acesso em: 6 ago. 2026.</w:t>
-      </w:r>
-    </w:p>
-    <w:p>
-      <w:pPr>
-        <w:spacing w:after="0" w:line="360" w:lineRule="auto"/>
-        <w:jc w:val="both"/>
+        <w:rPr>
+          <w:rFonts w:ascii="Arial" w:hAnsi="Arial" w:cs="Arial"/>
+          <w:sz w:val="24"/>
+          <w:szCs w:val="24"/>
+        </w:rPr>
+      </w:pPr>
+      <w:r>
+        <w:rPr>
+          <w:rFonts w:ascii="Arial" w:hAnsi="Arial" w:cs="Arial"/>
+          <w:sz w:val="24"/>
+          <w:szCs w:val="24"/>
+        </w:rPr>
+        <w:t>GAMEFIC. O que é gamificação? O g</w:t>
+      </w:r>
+      <w:r>
+        <w:rPr>
+          <w:rFonts w:ascii="Arial" w:hAnsi="Arial" w:cs="Arial"/>
+          <w:sz w:val="24"/>
+          <w:szCs w:val="24"/>
+        </w:rPr>
+        <w:t>uia definitivo</w:t>
+      </w:r>
+      <w:r>
+        <w:rPr>
+          <w:rFonts w:ascii="Arial" w:hAnsi="Arial" w:cs="Arial"/>
+          <w:sz w:val="24"/>
+          <w:szCs w:val="24"/>
+        </w:rPr>
+        <w:t>. Disponível em: https://www.gamefic.me/blog/o-que-e-gamificacao-o-guia-definitivo/. Acesso em: 6 ago. 2026.</w:t>
+      </w:r>
+    </w:p>
+    <w:p>
+      <w:pPr>
+        <w:spacing w:after="0" w:line="360" w:lineRule="auto"/>
         <w:rPr>
           <w:rFonts w:ascii="Arial" w:hAnsi="Arial" w:cs="Arial"/>
           <w:bCs/>
@@ -879,6 +1684,198 @@
         </w:rPr>
         <w:t>BALDISSERA, Olivia. O que é gamificação e como ela aumenta o engajamento. Pós PUCPR Digital, 5 abr. 2021. Disponível em: https://posdigital.pucpr.br/blog/gamificacao-engajamento. Acesso em: 6 ago. 2026.</w:t>
       </w:r>
+    </w:p>
+    <w:p>
+      <w:pPr>
+        <w:spacing w:after="0" w:line="360" w:lineRule="auto"/>
+        <w:rPr>
+          <w:rFonts w:ascii="Arial" w:hAnsi="Arial" w:cs="Arial"/>
+          <w:sz w:val="24"/>
+          <w:szCs w:val="24"/>
+          <w:u w:val="single"/>
+        </w:rPr>
+      </w:pPr>
+      <w:r>
+        <w:rPr>
+          <w:rFonts w:ascii="Arial" w:hAnsi="Arial" w:cs="Arial"/>
+          <w:sz w:val="24"/>
+          <w:szCs w:val="24"/>
+        </w:rPr>
+        <w:t xml:space="preserve">MEDEIROS, Adriana de Carvalho. </w:t>
+      </w:r>
+      <w:r>
+        <w:rPr>
+          <w:rFonts w:ascii="Arial" w:hAnsi="Arial" w:cs="Arial"/>
+          <w:sz w:val="24"/>
+          <w:szCs w:val="24"/>
+        </w:rPr>
+        <w:t>Um breve histórico sobre o ensino de História no Brasil: entre história oficial e direito à história</w:t>
+      </w:r>
+      <w:r>
+        <w:rPr>
+          <w:rFonts w:ascii="Arial" w:hAnsi="Arial" w:cs="Arial"/>
+          <w:sz w:val="24"/>
+          <w:szCs w:val="24"/>
+        </w:rPr>
+        <w:t>.</w:t>
+      </w:r>
+      <w:r>
+        <w:rPr>
+          <w:rFonts w:ascii="Arial" w:hAnsi="Arial" w:cs="Arial"/>
+          <w:sz w:val="24"/>
+          <w:szCs w:val="24"/>
+        </w:rPr>
+        <w:t> </w:t>
+      </w:r>
+      <w:r>
+        <w:rPr>
+          <w:rFonts w:ascii="Arial" w:hAnsi="Arial" w:cs="Arial"/>
+          <w:i/>
+          <w:iCs/>
+          <w:sz w:val="24"/>
+          <w:szCs w:val="24"/>
+        </w:rPr>
+        <w:t>Cadernos De Pesquisa Do CDHIS</w:t>
+      </w:r>
+      <w:r>
+        <w:rPr>
+          <w:rFonts w:ascii="Arial" w:hAnsi="Arial" w:cs="Arial"/>
+          <w:sz w:val="24"/>
+          <w:szCs w:val="24"/>
+        </w:rPr>
+        <w:t>, </w:t>
+      </w:r>
+      <w:r>
+        <w:rPr>
+          <w:rFonts w:ascii="Arial" w:hAnsi="Arial" w:cs="Arial"/>
+          <w:i/>
+          <w:iCs/>
+          <w:sz w:val="24"/>
+          <w:szCs w:val="24"/>
+        </w:rPr>
+        <w:t>34</w:t>
+      </w:r>
+      <w:r>
+        <w:rPr>
+          <w:rFonts w:ascii="Arial" w:hAnsi="Arial" w:cs="Arial"/>
+          <w:sz w:val="24"/>
+          <w:szCs w:val="24"/>
+        </w:rPr>
+        <w:t>(1), 164-194, 2021. Disponível em:</w:t>
+      </w:r>
+      <w:r>
+        <w:rPr>
+          <w:rFonts w:ascii="Arial" w:hAnsi="Arial" w:cs="Arial"/>
+          <w:sz w:val="24"/>
+          <w:szCs w:val="24"/>
+        </w:rPr>
+        <w:t> https://doi.org/10.14393/cdhis.v34n1.2021.42112</w:t>
+      </w:r>
+      <w:r>
+        <w:rPr>
+          <w:rFonts w:ascii="Arial" w:hAnsi="Arial" w:cs="Arial"/>
+          <w:sz w:val="24"/>
+          <w:szCs w:val="24"/>
+        </w:rPr>
+        <w:t>. Acesso em: 10 set. 2026</w:t>
+      </w:r>
+    </w:p>
+    <w:p>
+      <w:pPr>
+        <w:spacing w:after="0" w:line="360" w:lineRule="auto"/>
+        <w:rPr>
+          <w:rFonts w:ascii="Arial" w:hAnsi="Arial" w:cs="Arial"/>
+          <w:sz w:val="24"/>
+          <w:szCs w:val="24"/>
+          <w:u w:val="single"/>
+        </w:rPr>
+      </w:pPr>
+      <w:r>
+        <w:rPr>
+          <w:rFonts w:ascii="Arial" w:hAnsi="Arial" w:cs="Arial"/>
+          <w:sz w:val="24"/>
+          <w:szCs w:val="24"/>
+        </w:rPr>
+        <w:t>SPENGLER, Willian. Sociedade brasileira e ensino da história. Portal Deviante, 21 abr. 2023. Disponível em: https://www.deviante.com.br/noticias/sociedade-brasileira-e-ensino-da-historia/.</w:t>
+      </w:r>
+      <w:r>
+        <w:rPr>
+          <w:rFonts w:ascii="Arial" w:hAnsi="Arial" w:cs="Arial"/>
+          <w:sz w:val="24"/>
+          <w:szCs w:val="24"/>
+        </w:rPr>
+        <w:t xml:space="preserve"> </w:t>
+      </w:r>
+      <w:r>
+        <w:rPr>
+          <w:rFonts w:ascii="Arial" w:hAnsi="Arial" w:cs="Arial"/>
+          <w:sz w:val="24"/>
+          <w:szCs w:val="24"/>
+        </w:rPr>
+        <w:t>Acesso em: 10 set. 2026</w:t>
+      </w:r>
+    </w:p>
+    <w:p>
+      <w:pPr>
+        <w:spacing w:after="0" w:line="360" w:lineRule="auto"/>
+        <w:rPr>
+          <w:rFonts w:ascii="Arial" w:hAnsi="Arial" w:cs="Arial"/>
+          <w:sz w:val="24"/>
+          <w:szCs w:val="24"/>
+          <w:u w:val="single"/>
+        </w:rPr>
+      </w:pPr>
+      <w:r>
+        <w:rPr>
+          <w:rFonts w:ascii="Arial" w:hAnsi="Arial" w:cs="Arial"/>
+          <w:sz w:val="24"/>
+          <w:szCs w:val="24"/>
+        </w:rPr>
+        <w:t xml:space="preserve">SCHNEIDER, Simone Weber Cardoso; LEON, Adriana Duarte. A história do ensino de história no Brasil. </w:t>
+      </w:r>
+      <w:r>
+        <w:rPr>
+          <w:rFonts w:ascii="Arial" w:hAnsi="Arial" w:cs="Arial"/>
+          <w:bCs/>
+          <w:sz w:val="24"/>
+          <w:szCs w:val="24"/>
+        </w:rPr>
+        <w:t>Plurais</w:t>
+      </w:r>
+      <w:r>
+        <w:rPr>
+          <w:rFonts w:ascii="Arial" w:hAnsi="Arial" w:cs="Arial"/>
+          <w:sz w:val="24"/>
+          <w:szCs w:val="24"/>
+        </w:rPr>
+        <w:t>, 2022</w:t>
+      </w:r>
+      <w:r>
+        <w:rPr>
+          <w:rFonts w:ascii="Arial" w:hAnsi="Arial" w:cs="Arial"/>
+          <w:sz w:val="24"/>
+          <w:szCs w:val="24"/>
+        </w:rPr>
+        <w:t xml:space="preserve">. </w:t>
+      </w:r>
+      <w:r>
+        <w:rPr>
+          <w:rFonts w:ascii="Arial" w:hAnsi="Arial" w:cs="Arial"/>
+          <w:sz w:val="24"/>
+          <w:szCs w:val="24"/>
+        </w:rPr>
+        <w:t>Acesso em: 10 set. 2026</w:t>
+      </w:r>
+    </w:p>
+    <w:p>
+      <w:pPr>
+        <w:spacing w:after="0" w:line="360" w:lineRule="auto"/>
+        <w:rPr>
+          <w:rFonts w:ascii="Arial" w:hAnsi="Arial" w:cs="Arial"/>
+          <w:sz w:val="24"/>
+          <w:szCs w:val="24"/>
+        </w:rPr>
+      </w:pPr>
     </w:p>
     <w:p>
       <w:pPr>
@@ -893,12 +1890,62 @@
     </w:p>
     <w:sectPr>
       <w:pgSz w:w="11906" w:h="16838"/>
-      <w:pgMar w:top="1701" w:right="1134" w:bottom="1701" w:left="1134" w:header="709" w:footer="709" w:gutter="0"/>
+      <w:pgMar w:top="1701" w:right="1134" w:bottom="1134" w:left="1701" w:header="709" w:footer="709" w:gutter="0"/>
       <w:cols w:space="708"/>
       <w:docGrid w:linePitch="360"/>
     </w:sectPr>
   </w:body>
 </w:document>
+</file>
+
+<file path=word/endnotes.xml><?xml version="1.0" encoding="utf-8"?>
+<w:endnotes xmlns:wpc="http://schemas.microsoft.com/office/word/2010/wordprocessingCanvas" xmlns:cx="http://schemas.microsoft.com/office/drawing/2014/chartex" xmlns:mc="http://schemas.openxmlformats.org/markup-compatibility/2006" xmlns:o="urn:schemas-microsoft-com:office:office" xmlns:r="http://schemas.openxmlformats.org/officeDocument/2006/relationships" xmlns:m="http://schemas.openxmlformats.org/officeDocument/2006/math" xmlns:v="urn:schemas-microsoft-com:vml" xmlns:wp14="http://schemas.microsoft.com/office/word/2010/wordprocessingDrawing" xmlns:wp="http://schemas.openxmlformats.org/drawingml/2006/wordprocessingDrawing" xmlns:w10="urn:schemas-microsoft-com:office:word" xmlns:w="http://schemas.openxmlformats.org/wordprocessingml/2006/main" xmlns:w14="http://schemas.microsoft.com/office/word/2010/wordml" xmlns:w15="http://schemas.microsoft.com/office/word/2012/wordml" xmlns:w16se="http://schemas.microsoft.com/office/word/2015/wordml/symex" xmlns:wpg="http://schemas.microsoft.com/office/word/2010/wordprocessingGroup" xmlns:wpi="http://schemas.microsoft.com/office/word/2010/wordprocessingInk" xmlns:wne="http://schemas.microsoft.com/office/word/2006/wordml" xmlns:wps="http://schemas.microsoft.com/office/word/2010/wordprocessingShape" mc:Ignorable="w14 w15 w16se wp14">
+  <w:endnote w:type="separator" w:id="-1">
+    <w:p>
+      <w:pPr>
+        <w:spacing w:after="0" w:line="240" w:lineRule="auto"/>
+      </w:pPr>
+      <w:r>
+        <w:separator/>
+      </w:r>
+    </w:p>
+  </w:endnote>
+  <w:endnote w:type="continuationSeparator" w:id="0">
+    <w:p>
+      <w:pPr>
+        <w:spacing w:after="0" w:line="240" w:lineRule="auto"/>
+      </w:pPr>
+      <w:r>
+        <w:continuationSeparator/>
+      </w:r>
+    </w:p>
+  </w:endnote>
+</w:endnotes>
+</file>
+
+<file path=word/footnotes.xml><?xml version="1.0" encoding="utf-8"?>
+<w:footnotes xmlns:wpc="http://schemas.microsoft.com/office/word/2010/wordprocessingCanvas" xmlns:cx="http://schemas.microsoft.com/office/drawing/2014/chartex" xmlns:mc="http://schemas.openxmlformats.org/markup-compatibility/2006" xmlns:o="urn:schemas-microsoft-com:office:office" xmlns:r="http://schemas.openxmlformats.org/officeDocument/2006/relationships" xmlns:m="http://schemas.openxmlformats.org/officeDocument/2006/math" xmlns:v="urn:schemas-microsoft-com:vml" xmlns:wp14="http://schemas.microsoft.com/office/word/2010/wordprocessingDrawing" xmlns:wp="http://schemas.openxmlformats.org/drawingml/2006/wordprocessingDrawing" xmlns:w10="urn:schemas-microsoft-com:office:word" xmlns:w="http://schemas.openxmlformats.org/wordprocessingml/2006/main" xmlns:w14="http://schemas.microsoft.com/office/word/2010/wordml" xmlns:w15="http://schemas.microsoft.com/office/word/2012/wordml" xmlns:w16se="http://schemas.microsoft.com/office/word/2015/wordml/symex" xmlns:wpg="http://schemas.microsoft.com/office/word/2010/wordprocessingGroup" xmlns:wpi="http://schemas.microsoft.com/office/word/2010/wordprocessingInk" xmlns:wne="http://schemas.microsoft.com/office/word/2006/wordml" xmlns:wps="http://schemas.microsoft.com/office/word/2010/wordprocessingShape" mc:Ignorable="w14 w15 w16se wp14">
+  <w:footnote w:type="separator" w:id="-1">
+    <w:p>
+      <w:pPr>
+        <w:spacing w:after="0" w:line="240" w:lineRule="auto"/>
+      </w:pPr>
+      <w:r>
+        <w:separator/>
+      </w:r>
+    </w:p>
+  </w:footnote>
+  <w:footnote w:type="continuationSeparator" w:id="0">
+    <w:p>
+      <w:pPr>
+        <w:spacing w:after="0" w:line="240" w:lineRule="auto"/>
+      </w:pPr>
+      <w:r>
+        <w:continuationSeparator/>
+      </w:r>
+    </w:p>
+  </w:footnote>
+</w:footnotes>
 </file>
 
 <file path=word/styles.xml><?xml version="1.0" encoding="utf-8"?>
@@ -1334,6 +2381,61 @@
       <w:szCs w:val="24"/>
     </w:rPr>
   </w:style>
+  <w:style w:type="character" w:styleId="Hyperlink">
+    <w:name w:val="Hyperlink"/>
+    <w:basedOn w:val="Fontepargpadro"/>
+    <w:uiPriority w:val="99"/>
+    <w:unhideWhenUsed/>
+    <w:rsid w:val="00481DBD"/>
+    <w:rPr>
+      <w:color w:val="0563C1" w:themeColor="hyperlink"/>
+      <w:u w:val="single"/>
+    </w:rPr>
+  </w:style>
+  <w:style w:type="paragraph" w:styleId="Cabealho">
+    <w:name w:val="header"/>
+    <w:basedOn w:val="Normal"/>
+    <w:link w:val="CabealhoChar"/>
+    <w:uiPriority w:val="99"/>
+    <w:unhideWhenUsed/>
+    <w:rsid w:val="00481DBD"/>
+    <w:pPr>
+      <w:tabs>
+        <w:tab w:val="center" w:pos="4252"/>
+        <w:tab w:val="right" w:pos="8504"/>
+      </w:tabs>
+      <w:spacing w:after="0" w:line="240" w:lineRule="auto"/>
+    </w:pPr>
+  </w:style>
+  <w:style w:type="character" w:customStyle="1" w:styleId="CabealhoChar">
+    <w:name w:val="Cabeçalho Char"/>
+    <w:basedOn w:val="Fontepargpadro"/>
+    <w:link w:val="Cabealho"/>
+    <w:uiPriority w:val="99"/>
+    <w:rsid w:val="00481DBD"/>
+  </w:style>
+  <w:style w:type="paragraph" w:styleId="Rodap">
+    <w:name w:val="footer"/>
+    <w:basedOn w:val="Normal"/>
+    <w:link w:val="RodapChar"/>
+    <w:uiPriority w:val="99"/>
+    <w:unhideWhenUsed/>
+    <w:rsid w:val="00481DBD"/>
+    <w:pPr>
+      <w:tabs>
+        <w:tab w:val="center" w:pos="4252"/>
+        <w:tab w:val="right" w:pos="8504"/>
+      </w:tabs>
+      <w:spacing w:after="0" w:line="240" w:lineRule="auto"/>
+    </w:pPr>
+  </w:style>
+  <w:style w:type="character" w:customStyle="1" w:styleId="RodapChar">
+    <w:name w:val="Rodapé Char"/>
+    <w:basedOn w:val="Fontepargpadro"/>
+    <w:link w:val="Rodap"/>
+    <w:uiPriority w:val="99"/>
+    <w:rsid w:val="00481DBD"/>
+  </w:style>
 </w:styles>
 </file>
 
@@ -1596,4 +2698,16 @@
     </a:ext>
   </a:extLst>
 </a:theme>
+</file>
+
+<file path=customXml/item1.xml><?xml version="1.0" encoding="utf-8"?>
+<b:Sources xmlns:b="http://schemas.openxmlformats.org/officeDocument/2006/bibliography" xmlns="http://schemas.openxmlformats.org/officeDocument/2006/bibliography" SelectedStyle="\APASixthEditionOfficeOnline.xsl" StyleName="APA" Version="6"/>
+</file>
+
+<file path=customXml/itemProps1.xml><?xml version="1.0" encoding="utf-8"?>
+<ds:datastoreItem xmlns:ds="http://schemas.openxmlformats.org/officeDocument/2006/customXml" ds:itemID="{585CAE05-937B-437E-B279-04A3A9F37E12}">
+  <ds:schemaRefs>
+    <ds:schemaRef ds:uri="http://schemas.openxmlformats.org/officeDocument/2006/bibliography"/>
+  </ds:schemaRefs>
+</ds:datastoreItem>
 </file>
</xml_diff>